<commit_message>
Manual del facilitador: 6 o 7 ejercicios por lección y 28 MB de descarga
Co-Authored-By: Claude Fable 5.1 <noreply@anthropic.com>
</commit_message>
<xml_diff>
--- a/docs/Manual_del_facilitador_Mixtle_al_Rescate.docx
+++ b/docs/Manual_del_facilitador_Mixtle_al_Rescate.docx
@@ -441,7 +441,7 @@
                 <w:sz w:val="19"/>
                 <w:szCs w:val="19"/>
               </w:rPr>
-              <w:t xml:space="preserve">Cada lección dura unos 3 minutos (6 a 8 ejercicios). Cada aventura, de 2 a 4 minutos.</w:t>
+              <w:t xml:space="preserve">Cada lección dura unos 3 minutos (6 o 7 ejercicios). Cada aventura, de 2 a 4 minutos.</w:t>
             </w:r>
           </w:p>
         </w:tc>
@@ -600,7 +600,7 @@
                 <w:sz w:val="19"/>
                 <w:szCs w:val="19"/>
               </w:rPr>
-              <w:t xml:space="preserve">Solo la primera vez: el juego se descarga en segundo plano (unos 27 MB) y después funciona sin conexión. El modo facilitador avisa cuando está «Listo para usar sin internet».</w:t>
+              <w:t xml:space="preserve">Solo la primera vez: el juego se descarga en segundo plano (unos 28 MB) y después funciona sin conexión. El modo facilitador avisa cuando está «Listo para usar sin internet».</w:t>
             </w:r>
           </w:p>
         </w:tc>
@@ -1965,7 +1965,7 @@
     </w:p>
     <w:p>
       <w:r>
-        <w:t xml:space="preserve">Cada lección tiene de 6 a 8 ejercicios y dura unos 3 minutos. Arriba hay una barra que muestra cuánto falta, y Mixtle narra cada instrucción. Si alguien no escuchó, tocar la flecha circular junto a su globo para repetirla.</w:t>
+        <w:t xml:space="preserve">Cada lección tiene 6 o 7 ejercicios y dura unos 3 minutos. Arriba hay una barra que muestra cuánto falta, y Mixtle narra cada instrucción. Si alguien no escuchó, tocar la flecha circular junto a su globo para repetirla.</w:t>
       </w:r>
     </w:p>
     <w:p>

</xml_diff>